<commit_message>
Field Guide: current layout, Geo, headline strip, privacy dialog and today's screenshots
Co-Authored-By: Claude Opus 5.5 (1M context) <noreply@anthropic.com>
</commit_message>
<xml_diff>
--- a/docs/Nexxo-Field-Guide.docx
+++ b/docs/Nexxo-Field-Guide.docx
@@ -530,7 +530,7 @@
           <w:sz w:val="24"/>
           <w:szCs w:val="24"/>
         </w:rPr>
-        <w:t xml:space="preserve">. The Savannah River runs between the two states, and both sides are building along it. That border is "the seam" the app is named after.</w:t>
+        <w:t xml:space="preserve">. The Savannah River runs between the two states, and both sides are building along it.</w:t>
       </w:r>
     </w:p>
     <w:tbl>
@@ -1021,7 +1021,7 @@
           <wp:inline distT="0" distB="0" distL="0" distR="0">
             <wp:extent cx="5943600" cy="3045609"/>
             <wp:effectExtent t="0" r="0" b="0" l="0"/>
-            <wp:docPr id="1" name="overview.jpg" descr="The whole screen: the rail on the left, the Overlaps panel, the map, and the build-windows bar underneath." title="The whole screen: the rail on the left, the Overlaps panel, the map, and the build-windows bar underneath."/>
+            <wp:docPr id="1" name="overview.jpg" descr="The whole screen: the top bar, the filter bar over the map, the rail on the left, the Overlaps panel with the headline strip, the map, and the build-windows bar underneath." title="The whole screen: the top bar, the filter bar over the map, the rail on the left, the Overlaps panel with the headline strip, the map, and the build-windows bar underneath."/>
             <wp:cNvGraphicFramePr>
               <a:graphicFrameLocks xmlns:a="http://schemas.openxmlformats.org/drawingml/2006/main" noChangeAspect="1"/>
             </wp:cNvGraphicFramePr>
@@ -1070,7 +1070,7 @@
           <w:sz w:val="18"/>
           <w:szCs w:val="18"/>
         </w:rPr>
-        <w:t xml:space="preserve">The whole screen: the rail on the left, the Overlaps panel, the map, and the build-windows bar underneath.</w:t>
+        <w:t xml:space="preserve">The whole screen: the top bar, the filter bar over the map, the rail on the left, the Overlaps panel with the headline strip, the map, and the build-windows bar underneath.</w:t>
       </w:r>
     </w:p>
     <w:p>
@@ -1121,7 +1121,7 @@
                 <w:b/>
                 <w:bCs/>
               </w:rPr>
-              <w:t xml:space="preserve">Compare … ↔ …</w:t>
+              <w:t xml:space="preserve">Top bar</w:t>
             </w:r>
           </w:p>
         </w:tc>
@@ -1143,7 +1143,7 @@
           </w:tcPr>
           <w:p>
             <w:r>
-              <w:t xml:space="preserve">The two boxes at the top pick the two companies. The number after each name is how many planned projects it has. Pick </w:t>
+              <w:t xml:space="preserve">The Nexxo logo and tagline, then the two utility pickers. The number after each name is how many planned projects it has. Pick </w:t>
             </w:r>
             <w:r>
               <w:rPr>
@@ -1153,7 +1153,17 @@
               <w:t xml:space="preserve">None: just list projects</w:t>
             </w:r>
             <w:r>
-              <w:t xml:space="preserve"> in the second box to look at one company on its own (section 14).</w:t>
+              <w:t xml:space="preserve"> in the second box to look at one company on its own (section 14). The plans in use and their as-of date follow, and </w:t>
+            </w:r>
+            <w:r>
+              <w:rPr>
+                <w:b/>
+                <w:bCs/>
+              </w:rPr>
+              <w:t xml:space="preserve">More</w:t>
+            </w:r>
+            <w:r>
+              <w:t xml:space="preserve"> sits at the right.</w:t>
             </w:r>
           </w:p>
         </w:tc>
@@ -1182,7 +1192,7 @@
                 <w:b/>
                 <w:bCs/>
               </w:rPr>
-              <w:t xml:space="preserve">Filters</w:t>
+              <w:t xml:space="preserve">More</w:t>
             </w:r>
           </w:p>
         </w:tc>
@@ -1204,77 +1214,54 @@
           </w:tcPr>
           <w:p>
             <w:r>
-              <w:t xml:space="preserve">Everything that narrows the comparison: </w:t>
-            </w:r>
-            <w:r>
-              <w:rPr>
-                <w:b/>
-                <w:bCs/>
-              </w:rPr>
-              <w:t xml:space="preserve">Overlap within</w:t>
-            </w:r>
-            <w:r>
-              <w:t xml:space="preserve"> (40 km, about 25 miles, by default: roughly how far one crew yard can serve in a day), </w:t>
-            </w:r>
-            <w:r>
-              <w:rPr>
-                <w:b/>
-                <w:bCs/>
-              </w:rPr>
-              <w:t xml:space="preserve">Window buffer</w:t>
-            </w:r>
-            <w:r>
-              <w:t xml:space="preserve"> (how many months apart two build windows can be and still count as the same time), </w:t>
-            </w:r>
-            <w:r>
-              <w:rPr>
-                <w:b/>
-                <w:bCs/>
-              </w:rPr>
-              <w:t xml:space="preserve">Near / Near + same window / Same window</w:t>
-            </w:r>
-            <w:r>
-              <w:t xml:space="preserve">, the build period (</w:t>
-            </w:r>
-            <w:r>
-              <w:rPr>
-                <w:b/>
-                <w:bCs/>
-              </w:rPr>
-              <w:t xml:space="preserve">Next 12 mo</w:t>
-            </w:r>
-            <w:r>
-              <w:t xml:space="preserve">, </w:t>
-            </w:r>
-            <w:r>
-              <w:rPr>
-                <w:b/>
-                <w:bCs/>
-              </w:rPr>
-              <w:t xml:space="preserve">Next 3 yr</w:t>
-            </w:r>
-            <w:r>
-              <w:t xml:space="preserve">, </w:t>
-            </w:r>
-            <w:r>
-              <w:rPr>
-                <w:b/>
-                <w:bCs/>
-              </w:rPr>
-              <w:t xml:space="preserve">All</w:t>
-            </w:r>
-            <w:r>
-              <w:t xml:space="preserve">), and </w:t>
-            </w:r>
-            <w:r>
-              <w:rPr>
-                <w:b/>
-                <w:bCs/>
-              </w:rPr>
-              <w:t xml:space="preserve">Include dates already passed</w:t>
-            </w:r>
-            <w:r>
-              <w:t xml:space="preserve">. The button shows the current settings, for example "40 km · all dates".</w:t>
+              <w:rPr>
+                <w:b/>
+                <w:bCs/>
+              </w:rPr>
+              <w:t xml:space="preserve">Share this view</w:t>
+            </w:r>
+            <w:r>
+              <w:t xml:space="preserve"> copies a link to exactly what's on screen (companies, filters, tab, selected pair, basemap, 3D and camera), so the other company opens the same view. </w:t>
+            </w:r>
+            <w:r>
+              <w:rPr>
+                <w:b/>
+                <w:bCs/>
+              </w:rPr>
+              <w:t xml:space="preserve">Export CSV</w:t>
+            </w:r>
+            <w:r>
+              <w:t xml:space="preserve"> downloads the list for Excel or Google Sheets. </w:t>
+            </w:r>
+            <w:r>
+              <w:rPr>
+                <w:b/>
+                <w:bCs/>
+              </w:rPr>
+              <w:t xml:space="preserve">Import plans</w:t>
+            </w:r>
+            <w:r>
+              <w:t xml:space="preserve"> and </w:t>
+            </w:r>
+            <w:r>
+              <w:rPr>
+                <w:b/>
+                <w:bCs/>
+              </w:rPr>
+              <w:t xml:space="preserve">Unit costs</w:t>
+            </w:r>
+            <w:r>
+              <w:t xml:space="preserve"> open the same dialogs as the rail. </w:t>
+            </w:r>
+            <w:r>
+              <w:rPr>
+                <w:b/>
+                <w:bCs/>
+              </w:rPr>
+              <w:t xml:space="preserve">About, terms and privacy</w:t>
+            </w:r>
+            <w:r>
+              <w:t xml:space="preserve"> opens a dialog with three tabs: About and sources (the plans, map data and software behind the app), Terms (a planning aid, not engineering, legal or financial advice) and Privacy (no Nexxo server and no account; what stays in your browser, and what goes to Anthropic, only when you ask Geo an open-ended question with your own key).</w:t>
             </w:r>
           </w:p>
         </w:tc>
@@ -1303,7 +1290,7 @@
                 <w:b/>
                 <w:bCs/>
               </w:rPr>
-              <w:t xml:space="preserve">More</w:t>
+              <w:t xml:space="preserve">Filter bar</w:t>
             </w:r>
           </w:p>
         </w:tc>
@@ -1325,24 +1312,47 @@
           </w:tcPr>
           <w:p>
             <w:r>
-              <w:rPr>
-                <w:b/>
-                <w:bCs/>
-              </w:rPr>
-              <w:t xml:space="preserve">Share this view</w:t>
-            </w:r>
-            <w:r>
-              <w:t xml:space="preserve"> copies a link to exactly what's on screen (companies, filters, tab, selected pair, basemap, 3D and camera), so the other company opens the same view. </w:t>
-            </w:r>
-            <w:r>
-              <w:rPr>
-                <w:b/>
-                <w:bCs/>
-              </w:rPr>
-              <w:t xml:space="preserve">Export CSV</w:t>
-            </w:r>
-            <w:r>
-              <w:t xml:space="preserve"> downloads the list for Excel or Google Sheets. Import plans and Unit costs are here too.</w:t>
+              <w:t xml:space="preserve">The bar over the map. </w:t>
+            </w:r>
+            <w:r>
+              <w:rPr>
+                <w:b/>
+                <w:bCs/>
+              </w:rPr>
+              <w:t xml:space="preserve">Show routes</w:t>
+            </w:r>
+            <w:r>
+              <w:t xml:space="preserve"> chips filter by tier: All 169, Touching 4, &lt; 1.6 km 1, &lt; 8 km 12 and &lt; 40 km 152 (section 2). </w:t>
+            </w:r>
+            <w:r>
+              <w:rPr>
+                <w:b/>
+                <w:bCs/>
+              </w:rPr>
+              <w:t xml:space="preserve">Within</w:t>
+            </w:r>
+            <w:r>
+              <w:t xml:space="preserve"> sets how close counts as an overlap: 40 km (about 25 miles) by default, roughly how far one crew yard can serve in a day. </w:t>
+            </w:r>
+            <w:r>
+              <w:rPr>
+                <w:b/>
+                <w:bCs/>
+              </w:rPr>
+              <w:t xml:space="preserve">Building</w:t>
+            </w:r>
+            <w:r>
+              <w:t xml:space="preserve"> limits the build period: Next 12 mo, Next 3 yr or All dates. </w:t>
+            </w:r>
+            <w:r>
+              <w:rPr>
+                <w:b/>
+                <w:bCs/>
+              </w:rPr>
+              <w:t xml:space="preserve">More filters</w:t>
+            </w:r>
+            <w:r>
+              <w:t xml:space="preserve"> unfolds the rest: Window buffer (how many months apart two build windows can be and still count as the same time), Near / Near + same window / Same window, and Include dates already passed.</w:t>
             </w:r>
           </w:p>
         </w:tc>
@@ -1450,10 +1460,10 @@
                 <w:b/>
                 <w:bCs/>
               </w:rPr>
-              <w:t xml:space="preserve">Ask</w:t>
-            </w:r>
-            <w:r>
-              <w:t xml:space="preserve"> (section 11). </w:t>
+              <w:t xml:space="preserve">Geo</w:t>
+            </w:r>
+            <w:r>
+              <w:t xml:space="preserve">, the assistant (section 11). Press Geo again to close it and go back to the view you had. </w:t>
             </w:r>
             <w:r>
               <w:rPr>
@@ -1502,7 +1512,7 @@
                 <w:b/>
                 <w:bCs/>
               </w:rPr>
-              <w:t xml:space="preserve">Ask button</w:t>
+              <w:t xml:space="preserve">Panel tab</w:t>
             </w:r>
           </w:p>
         </w:tc>
@@ -1524,17 +1534,7 @@
           </w:tcPr>
           <w:p>
             <w:r>
-              <w:t xml:space="preserve">The floating </w:t>
-            </w:r>
-            <w:r>
-              <w:rPr>
-                <w:b/>
-                <w:bCs/>
-              </w:rPr>
-              <w:t xml:space="preserve">Ask</w:t>
-            </w:r>
-            <w:r>
-              <w:t xml:space="preserve"> button at the top left of the map opens the assistant from anywhere.</w:t>
+              <w:t xml:space="preserve">The small tab on the edge of the results panel collapses it, leaving the rail, the filter bar and the map. Press it again, or any rail button, to bring the panel back.</w:t>
             </w:r>
           </w:p>
         </w:tc>
@@ -1574,7 +1574,7 @@
         <w:spacing w:after="140"/>
       </w:pPr>
       <w:r>
-        <w:t xml:space="preserve">The Overlaps panel opens with four tiles. Read them first: they are the answer in one glance.</w:t>
+        <w:t xml:space="preserve">The Overlaps panel opens with a strip of four headline numbers. Read them first: they are the answer in one glance.</w:t>
       </w:r>
     </w:p>
     <w:tbl>
@@ -1619,6 +1619,9 @@
               </w:rPr>
               <w:t xml:space="preserve">169 overlaps</w:t>
             </w:r>
+            <w:r>
+              <w:t xml:space="preserve"> of 10,304 pairs</w:t>
+            </w:r>
           </w:p>
         </w:tc>
         <w:tc>
@@ -1668,7 +1671,10 @@
                 <w:b/>
                 <w:bCs/>
               </w:rPr>
-              <w:t xml:space="preserve">$13.6M expected savings</w:t>
+              <w:t xml:space="preserve">$13.6M expected</w:t>
+            </w:r>
+            <w:r>
+              <w:t xml:space="preserve"> ($15.2M if dates hold)</w:t>
             </w:r>
           </w:p>
         </w:tc>
@@ -1690,7 +1696,7 @@
           </w:tcPr>
           <w:p>
             <w:r>
-              <w:t xml:space="preserve">What the flagged pairs could save by coordinating, weighted by the chance they really share a window. It would be $15.2M if every date held (section 15).</w:t>
+              <w:t xml:space="preserve">What the flagged pairs could save by coordinating, weighted by the chance they really share a window. If every date held it would be $15.2M (section 15).</w:t>
             </w:r>
           </w:p>
         </w:tc>
@@ -1721,6 +1727,9 @@
               </w:rPr>
               <w:t xml:space="preserve">+$2.5M joint schedule</w:t>
             </w:r>
+            <w:r>
+              <w:t xml:space="preserve"> (8 date moves)</w:t>
+            </w:r>
           </w:p>
         </w:tc>
         <w:tc>
@@ -1741,7 +1750,7 @@
           </w:tcPr>
           <w:p>
             <w:r>
-              <w:t xml:space="preserve">What the optimizer's 8 suggested date moves would add (section 7).</w:t>
+              <w:t xml:space="preserve">What the optimizer's 8 suggested date moves would add. Click it to open Plan (section 7).</w:t>
             </w:r>
           </w:p>
         </w:tc>
@@ -1772,6 +1781,9 @@
               </w:rPr>
               <w:t xml:space="preserve">4 to check</w:t>
             </w:r>
+            <w:r>
+              <w:t xml:space="preserve"> (data checks)</w:t>
+            </w:r>
           </w:p>
         </w:tc>
         <w:tc>
@@ -1792,7 +1804,7 @@
           </w:tcPr>
           <w:p>
             <w:r>
-              <w:t xml:space="preserve">Data checks that flagged records to review (section 9). The same number sits on the Checks button in the rail.</w:t>
+              <w:t xml:space="preserve">Data checks that flagged records to review. Click it to open Checks (section 9). The same number sits on the Checks button in the rail.</w:t>
             </w:r>
           </w:p>
         </w:tc>
@@ -2226,57 +2238,17 @@
         <w:spacing w:after="140"/>
       </w:pPr>
       <w:r>
-        <w:t xml:space="preserve">The chips under the tiles filter the list by tier: </w:t>
-      </w:r>
-      <w:r>
-        <w:rPr>
-          <w:b/>
-          <w:bCs/>
-        </w:rPr>
-        <w:t xml:space="preserve">All 169</w:t>
-      </w:r>
-      <w:r>
-        <w:t xml:space="preserve">, </w:t>
-      </w:r>
-      <w:r>
-        <w:rPr>
-          <w:b/>
-          <w:bCs/>
-        </w:rPr>
-        <w:t xml:space="preserve">Touching 4</w:t>
-      </w:r>
-      <w:r>
-        <w:t xml:space="preserve">, </w:t>
-      </w:r>
-      <w:r>
-        <w:rPr>
-          <w:b/>
-          <w:bCs/>
-        </w:rPr>
-        <w:t xml:space="preserve">&lt; 1.6 km 1</w:t>
-      </w:r>
-      <w:r>
-        <w:t xml:space="preserve">, </w:t>
-      </w:r>
-      <w:r>
-        <w:rPr>
-          <w:b/>
-          <w:bCs/>
-        </w:rPr>
-        <w:t xml:space="preserve">&lt; 8 km 12</w:t>
-      </w:r>
-      <w:r>
-        <w:t xml:space="preserve"> and </w:t>
-      </w:r>
-      <w:r>
-        <w:rPr>
-          <w:b/>
-          <w:bCs/>
-        </w:rPr>
-        <w:t xml:space="preserve">&lt; 40 km 152</w:t>
-      </w:r>
-      <w:r>
-        <w:t xml:space="preserve">.</w:t>
+        <w:t xml:space="preserve">The </w:t>
+      </w:r>
+      <w:r>
+        <w:rPr>
+          <w:b/>
+          <w:bCs/>
+        </w:rPr>
+        <w:t xml:space="preserve">Show routes</w:t>
+      </w:r>
+      <w:r>
+        <w:t xml:space="preserve"> chips in the filter bar over the map narrow the pairs by tier: All 169, Touching 4, &lt; 1.6 km 1, &lt; 8 km 12 and &lt; 40 km 152. The app opens on All 169.</w:t>
       </w:r>
     </w:p>
     <w:p>
@@ -3086,10 +3058,10 @@
                 <w:b/>
                 <w:bCs/>
               </w:rPr>
-              <w:t xml:space="preserve">Overlap within</w:t>
-            </w:r>
-            <w:r>
-              <w:t xml:space="preserve"> under Filters to include them.</w:t>
+              <w:t xml:space="preserve">Within</w:t>
+            </w:r>
+            <w:r>
+              <w:t xml:space="preserve"> in the filter bar to include them.</w:t>
             </w:r>
           </w:p>
         </w:tc>
@@ -3135,7 +3107,7 @@
           <wp:inline distT="0" distB="0" distL="0" distR="0">
             <wp:extent cx="5943600" cy="3045609"/>
             <wp:effectExtent t="0" r="0" b="0" l="0"/>
-            <wp:docPr id="3" name="pair.jpg" descr="Pair #4 of 169, Jasper - Okatie #2 and Plant McIntosh Unit 12, with the map flown to it." title="Pair #4 of 169, Jasper - Okatie #2 and Plant McIntosh Unit 12, with the map flown to it."/>
+            <wp:docPr id="3" name="pair.jpg" descr="Pair #4 of 169, Jasper - Okatie #2 and Plant McIntosh Unit 12, with the map flown to it in 3D over satellite imagery." title="Pair #4 of 169, Jasper - Okatie #2 and Plant McIntosh Unit 12, with the map flown to it in 3D over satellite imagery."/>
             <wp:cNvGraphicFramePr>
               <a:graphicFrameLocks xmlns:a="http://schemas.openxmlformats.org/drawingml/2006/main" noChangeAspect="1"/>
             </wp:cNvGraphicFramePr>
@@ -3184,7 +3156,7 @@
           <w:sz w:val="18"/>
           <w:szCs w:val="18"/>
         </w:rPr>
-        <w:t xml:space="preserve">Pair #4 of 169, Jasper - Okatie #2 and Plant McIntosh Unit 12, with the map flown to it.</w:t>
+        <w:t xml:space="preserve">Pair #4 of 169, Jasper - Okatie #2 and Plant McIntosh Unit 12, with the map flown to it in 3D over satellite imagery.</w:t>
       </w:r>
     </w:p>
     <w:p>
@@ -4121,7 +4093,7 @@
           </w:tcPr>
           <w:p>
             <w:r>
-              <w:t xml:space="preserve">A report over the whole comparison: pairs checked, pairs flagged, expected savings and the pairs just outside the screen, with the projects ranked. Ask for it in Ask, for example "a report of the longest projects"; this works without a key too.</w:t>
+              <w:t xml:space="preserve">A report over the whole comparison: pairs checked, pairs flagged, expected savings and the pairs just outside the screen, with the projects ranked. Ask Geo for it, for example "a report of the longest projects"; this works without a key too.</w:t>
             </w:r>
           </w:p>
         </w:tc>
@@ -4137,7 +4109,7 @@
         <w:spacing w:after="140"/>
       </w:pPr>
       <w:r>
-        <w:t xml:space="preserve">Ask can open any of the three for you, and in Spanish when you ask in Spanish.</w:t>
+        <w:t xml:space="preserve">Geo can open any of the three for you, in Spanish when you ask in Spanish.</w:t>
       </w:r>
     </w:p>
     <w:p>
@@ -4180,7 +4152,7 @@
           <wp:inline distT="0" distB="0" distL="0" distR="0">
             <wp:extent cx="5943600" cy="3045609"/>
             <wp:effectExtent t="0" r="0" b="0" l="0"/>
-            <wp:docPr id="6" name="ask.jpg" descr="Ask with no API key: why a pair is not flagged, and one pair explained." title="Ask with no API key: why a pair is not flagged, and one pair explained."/>
+            <wp:docPr id="6" name="ask.jpg" descr="Geo answering &quot;Which three date moves would save the most?&quot; with no API key: the moves, and a bar chart of what each adds." title="Geo answering &quot;Which three date moves would save the most?&quot; with no API key: the moves, and a bar chart of what each adds."/>
             <wp:cNvGraphicFramePr>
               <a:graphicFrameLocks xmlns:a="http://schemas.openxmlformats.org/drawingml/2006/main" noChangeAspect="1"/>
             </wp:cNvGraphicFramePr>
@@ -4229,7 +4201,7 @@
           <w:sz w:val="18"/>
           <w:szCs w:val="18"/>
         </w:rPr>
-        <w:t xml:space="preserve">Ask with no API key: why a pair is not flagged, and one pair explained.</w:t>
+        <w:t xml:space="preserve">Geo answering "Which three date moves would save the most?" with no API key: the moves, and a bar chart of what each adds.</w:t>
       </w:r>
     </w:p>
     <w:p>
@@ -4244,10 +4216,20 @@
           <w:b/>
           <w:bCs/>
         </w:rPr>
-        <w:t xml:space="preserve">Ask</w:t>
-      </w:r>
-      <w:r>
-        <w:t xml:space="preserve"> in the rail or on the map and type a question in plain language, in English or Spanish (the </w:t>
+        <w:t xml:space="preserve">Geo</w:t>
+      </w:r>
+      <w:r>
+        <w:t xml:space="preserve"> in the rail to open the assistant; press it again to close it. The panel opens with "Hey, I'm Geo", one line on what it answers from, a short </w:t>
+      </w:r>
+      <w:r>
+        <w:rPr>
+          <w:b/>
+          <w:bCs/>
+        </w:rPr>
+        <w:t xml:space="preserve">What I can do</w:t>
+      </w:r>
+      <w:r>
+        <w:t xml:space="preserve"> list (in English only), and four example questions. Type a question in plain language, in English or Spanish (the </w:t>
       </w:r>
       <w:r>
         <w:rPr>
@@ -4257,7 +4239,7 @@
         <w:t xml:space="preserve">EN / ES</w:t>
       </w:r>
       <w:r>
-        <w:t xml:space="preserve"> switch at the top), or click one of the suggestions above the box. For example: "Which overlaps near Augusta are most likely to happen?", "Why isn't DESC-11 paired with IRP-20277?" or "¿Qué cambió en el plan de DESC?".</w:t>
+        <w:t xml:space="preserve"> toggle at the top), or click an example. Others to try: "Which overlaps near Augusta are most likely to happen?", "Why isn't DESC-11 paired with IRP-20277?" or "¿Qué cambió en el plan de DESC?".</w:t>
       </w:r>
     </w:p>
     <w:p>
@@ -4265,7 +4247,7 @@
         <w:spacing w:after="140"/>
       </w:pPr>
       <w:r>
-        <w:t xml:space="preserve">The assistant answers from the same data as the screen, using 14 tools: search and rank projects, list and explain overlaps, compare two projects, say why a pair is not flagged, plan changes, the schedule optimizer and the data checks, plus four that act on the page: show something on the map, and open a coordination brief, the joint schedule proposal or a report.</w:t>
+        <w:t xml:space="preserve">Geo answers from the same data as the screen, using 14 tools: search and rank projects, list and explain overlaps, compare two projects, say why a pair is not flagged, plan changes, the schedule optimizer and the data checks, plus four that act on the page: show something on the map, and open a coordination brief, the joint schedule proposal or a report.</w:t>
       </w:r>
     </w:p>
     <w:tbl>
@@ -4318,7 +4300,7 @@
           </w:p>
           <w:p>
             <w:r>
-              <w:t xml:space="preserve">Without an API key, or when it can't reach the internet, Ask still answers the common questions: the top overlaps, pairs within a distance, the most likely ones, pairs in the same window, what's planned near a place, one project or pair, what changed between plans, which date moves pay most, how many pairs were checked, and the data checks. Those answers end with "(Answered without the language model.)". Anything it can't place with confidence asks for a key instead of guessing.</w:t>
+              <w:t xml:space="preserve">Without an API key, or when it can't reach the internet, Geo still answers the common questions: the top overlaps, pairs within a distance, the most likely ones, pairs in the same window, what's planned near a place, one project or pair, what changed between plans, which date moves pay most, how many pairs were checked, and the data checks. Those answers end with "(Answered without the language model.)". Anything it can't place with confidence asks for a key instead of guessing.</w:t>
             </w:r>
           </w:p>
         </w:tc>
@@ -4344,7 +4326,17 @@
         <w:t xml:space="preserve">Connect an Anthropic key for open-ended questions</w:t>
       </w:r>
       <w:r>
-        <w:t xml:space="preserve"> at the bottom and paste your own key. The site has no server: the key stays in that browser and is sent only to Anthropic.</w:t>
+        <w:t xml:space="preserve"> under the input and paste your own key; </w:t>
+      </w:r>
+      <w:r>
+        <w:rPr>
+          <w:b/>
+          <w:bCs/>
+        </w:rPr>
+        <w:t xml:space="preserve">Privacy</w:t>
+      </w:r>
+      <w:r>
+        <w:t xml:space="preserve"> next to it says what is sent where. The site has no server: the key stays in that browser and is sent only to Anthropic.</w:t>
       </w:r>
     </w:p>
     <w:p>
@@ -4387,7 +4379,7 @@
           <wp:inline distT="0" distB="0" distL="0" distR="0">
             <wp:extent cx="5943600" cy="2811038"/>
             <wp:effectExtent t="0" r="0" b="0" l="0"/>
-            <wp:docPr id="7" name="illustration.jpg" descr="Pair #4 as a landscape: Plant McIntosh's combined-cycle unit, the shared laydown yard, and the new line's towers." title="Pair #4 as a landscape: Plant McIntosh's combined-cycle unit, the shared laydown yard, and the new line's towers."/>
+            <wp:docPr id="7" name="illustration.jpg" descr="Pair #4 as a landscape: Plant McIntosh's combined-cycle unit, the shared laydown yard, and the Jasper - Okatie line's towers, a span apart, with the 4.28 km gap marked." title="Pair #4 as a landscape: Plant McIntosh's combined-cycle unit, the shared laydown yard, and the Jasper - Okatie line's towers, a span apart, with the 4.28 km gap marked."/>
             <wp:cNvGraphicFramePr>
               <a:graphicFrameLocks xmlns:a="http://schemas.openxmlformats.org/drawingml/2006/main" noChangeAspect="1"/>
             </wp:cNvGraphicFramePr>
@@ -4436,7 +4428,7 @@
           <w:sz w:val="18"/>
           <w:szCs w:val="18"/>
         </w:rPr>
-        <w:t xml:space="preserve">Pair #4 as a landscape: Plant McIntosh's combined-cycle unit, the shared laydown yard, and the new line's towers.</w:t>
+        <w:t xml:space="preserve">Pair #4 as a landscape: Plant McIntosh's combined-cycle unit, the shared laydown yard, and the Jasper - Okatie line's towers, a span apart, with the 4.28 km gap marked.</w:t>
       </w:r>
     </w:p>
     <w:p>
@@ -4462,7 +4454,7 @@
         <w:spacing w:after="140"/>
       </w:pPr>
       <w:r>
-        <w:t xml:space="preserve">The ground is a cut-out block shaped from real elevation data; heights are stretched so the flat river country reads, and the footer gives the real range. Distances along the ground are to scale. Offline, it falls back to an illustrative ground.</w:t>
+        <w:t xml:space="preserve">The ground is a cut-out block shaped from real elevation data; heights are stretched so the flat river country reads, and the footer gives the real range. Distances along the ground are to scale. Towers stand a span apart along each line, as on a real line, rather than packed together; they are drawn taller than the ground scale so they read. Offline, it falls back to an illustrative ground.</w:t>
       </w:r>
     </w:p>
     <w:p>
@@ -4656,7 +4648,7 @@
         <w:spacing w:after="140"/>
       </w:pPr>
       <w:r>
-        <w:t xml:space="preserve">Set the second Compare box to </w:t>
+        <w:t xml:space="preserve">Set the second utility picker in the top bar to </w:t>
       </w:r>
       <w:r>
         <w:rPr>
@@ -4666,7 +4658,7 @@
         <w:t xml:space="preserve">None: just list projects</w:t>
       </w:r>
       <w:r>
-        <w:t xml:space="preserve"> and Nexxo stops pairing. It lists every project for the first company with voltage, type, name, in-service date and cost. The headline tiles and pair links go away because there's nothing to compare.</w:t>
+        <w:t xml:space="preserve"> and Nexxo stops pairing. It lists every project for the first company with voltage, type, name, in-service date and cost. The headline numbers and pair links go away because there's nothing to compare.</w:t>
       </w:r>
     </w:p>
     <w:p>
@@ -5731,7 +5723,7 @@
         <w:spacing w:after="80"/>
       </w:pPr>
       <w:r>
-        <w:t xml:space="preserve">Open the app with Relief and Grid on. Point at the tiles: 10,304 pairs checked, 169 overlaps, $13.6M expected savings. The thin lines underneath are today's grid, 10,092 real lines.</w:t>
+        <w:t xml:space="preserve">Open the app with Relief and Grid on. Point at the headline strip: 169 overlaps of 10,304 pairs, $13.6M expected savings. The thin lines underneath are today's grid, 10,092 real lines.</w:t>
       </w:r>
     </w:p>
     <w:p>
@@ -5777,7 +5769,7 @@
         <w:t xml:space="preserve">Changes</w:t>
       </w:r>
       <w:r>
-        <w:t xml:space="preserve">: 23 of 30 DESC projects slipped, a year at the median, and the last updates opened 9 shared windows and closed 3.</w:t>
+        <w:t xml:space="preserve">: 23 of 30 DESC projects slipped, 12 months at the median, and the last updates opened 9 shared windows and closed 3.</w:t>
       </w:r>
     </w:p>
     <w:p>
@@ -5919,10 +5911,10 @@
           <w:b/>
           <w:bCs/>
         </w:rPr>
-        <w:t xml:space="preserve">Ask</w:t>
-      </w:r>
-      <w:r>
-        <w:t xml:space="preserve"> and click a suggestion. The common questions work even without a key.</w:t>
+        <w:t xml:space="preserve">Geo</w:t>
+      </w:r>
+      <w:r>
+        <w:t xml:space="preserve"> and click the example "Which three date moves would save the most?". The common questions work even without a key.</w:t>
       </w:r>
     </w:p>
     <w:sectPr>

</xml_diff>

<commit_message>
Fix doc errors found in the submission audit
- README: correct Geo examples and figures, US spelling, project layout, test list
- DEMO: pair #6 wording, button names, section headings, FERC claim
- Field Guide: remove internal note, fix Geo example, walker demo and grid wording
- About and Privacy: list the Anthropic SDK and the services actually contacted
- Walk footer names the real button

Co-Authored-By: Claude Opus 5.5 (1M context) <noreply@anthropic.com>
</commit_message>
<xml_diff>
--- a/docs/Nexxo-Field-Guide.docx
+++ b/docs/Nexxo-Field-Guide.docx
@@ -58,7 +58,7 @@
           <w:sz w:val="19"/>
           <w:szCs w:val="19"/>
         </w:rPr>
-        <w:t xml:space="preserve">Prepared for Juan · ShellHacks 2026 · Nexxo compares Dominion Energy South Carolina with Georgia's power companies along the Savannah River.</w:t>
+        <w:t xml:space="preserve">ShellHacks 2026 · Sperry Tech GridLock challenge · Nexxo compares Dominion Energy South Carolina with Georgia's power companies along the Savannah River.</w:t>
       </w:r>
     </w:p>
     <w:p>
@@ -2451,7 +2451,7 @@
               <w:t xml:space="preserve">Grid</w:t>
             </w:r>
             <w:r>
-              <w:t xml:space="preserve"> draws today's transmission lines underneath: 10,092 lines of 115 kV and up in Georgia and South Carolina, from OpenStreetMap, colored by voltage. It shows when the app is served (npm start or the website), not when index.html is opened straight from disk.</w:t>
+              <w:t xml:space="preserve"> draws today's transmission lines underneath: 10,092 lines of 115 kV and up in Georgia and South Carolina, from OpenStreetMap, in shades of gray that darken and widen with voltage. It shows when the app is served (npm start or the website), not when index.html is opened straight from disk.</w:t>
             </w:r>
           </w:p>
         </w:tc>
@@ -2830,7 +2830,7 @@
           </w:p>
           <w:p>
             <w:r>
-              <w:t xml:space="preserve">Drag the orange figure from the bottom right of the map onto any project, like Street View. The 3D illustration of that project's most valuable pair opens at ground level where it landed (section 12). Walk with W A S D or the arrow keys, drag to look around, hold Shift to run.</w:t>
+              <w:t xml:space="preserve">Drag the orange figure from the bottom right of the map onto any project, like Street View. The 3D illustration of that project's most valuable pair opens at ground level where it landed (section 12). Walk with W A S D or the arrow keys, click the view, then move the mouse to look around (Esc frees the mouse), hold Shift to run.</w:t>
             </w:r>
           </w:p>
         </w:tc>
@@ -4239,7 +4239,7 @@
         <w:t xml:space="preserve">EN / ES</w:t>
       </w:r>
       <w:r>
-        <w:t xml:space="preserve"> toggle at the top), or click an example. Others to try: "Which overlaps near Augusta are most likely to happen?", "Why isn't DESC-11 paired with IRP-20277?" or "¿Qué cambió en el plan de DESC?".</w:t>
+        <w:t xml:space="preserve"> toggle at the top), or click an example. Others to try: "Which overlaps near Augusta are most likely to happen?", "Why isn't DESCP-10 paired with IRP-19523?" or "¿Qué cambió en el plan de DESC?".</w:t>
       </w:r>
     </w:p>
     <w:p>
@@ -5557,7 +5557,7 @@
         <w:spacing w:after="140"/>
       </w:pPr>
       <w:r>
-        <w:t xml:space="preserve">When a plan doesn't list a cost, Nexxo estimates one from typical prices: about $2.5M per km for a new 500 kV line, $1.4M at 230 kV, $0.95M at 115 kV, half that for rebuilds, and $8M to $60M for a substation depending on voltage.</w:t>
+        <w:t xml:space="preserve">When a plan doesn't list a cost, Nexxo estimates one from typical prices: about $2.5M per km for a new 500 kV line, $1.4M at 230 kV, $0.95M at 115 kV, about half that for rebuilds, and $8M to $60M for a substation depending on voltage.</w:t>
       </w:r>
     </w:p>
     <w:tbl>
@@ -5805,7 +5805,7 @@
         <w:spacing w:after="80"/>
       </w:pPr>
       <w:r>
-        <w:t xml:space="preserve">Drag the orange walker onto the Jasper - Okatie line, walk with W toward the towers and the shared yard, then close it.</w:t>
+        <w:t xml:space="preserve">Sort by Chance, open the top pair (Urquhart × Callaway Road - Thomson) and drag the orange walker onto the Callaway Road - Thomson line, walk with W toward the towers and the shared yard, then close it.</w:t>
       </w:r>
     </w:p>
     <w:p>

</xml_diff>